<commit_message>
Update Daftar Pustaka with valid 2021-2026 references
</commit_message>
<xml_diff>
--- a/TUGAS-AUDIT-SDIT/02_Laporan/Laporan-Audit-SI-SDIT_Al-huda.docx
+++ b/TUGAS-AUDIT-SDIT/02_Laporan/Laporan-Audit-SI-SDIT_Al-huda.docx
@@ -7588,6 +7588,20 @@
           <w:rFonts w:ascii="Times New Roman" w:hAnsi="Times New Roman"/>
           <w:sz w:val="24"/>
         </w:rPr>
+        <w:t>Fitri, A. E., Nurhasanah, S., &amp; Elyana, I. (2024). Audit Sistem Informasi PPDB SMK Sandikta Menggunakan COBIT 2019. Jurnal Sistem Informasi Universitas Nusa Mandiri, 19(1), 40–45.</w:t>
+      </w:r>
+    </w:p>
+    <w:p>
+      <w:pPr>
+        <w:spacing w:line="360" w:lineRule="auto" w:after="120"/>
+        <w:ind w:left="709" w:hanging="709"/>
+        <w:jc w:val="both"/>
+      </w:pPr>
+      <w:r>
+        <w:rPr>
+          <w:rFonts w:ascii="Times New Roman" w:hAnsi="Times New Roman"/>
+          <w:sz w:val="24"/>
+        </w:rPr>
         <w:t>ISACA. (2018). COBIT 2019 Framework: Introduction and Methodology. Schaumburg, IL: ISACA.</w:t>
       </w:r>
     </w:p>
@@ -7616,7 +7630,7 @@
           <w:rFonts w:ascii="Times New Roman" w:hAnsi="Times New Roman"/>
           <w:sz w:val="24"/>
         </w:rPr>
-        <w:t>Jogiyanto, H. M. (2005). Analisis dan Desain Sistem Informasi: Pendekatan Terstruktur Teori dan Praktik Aplikasi Bisnis. Yogyakarta: Andi Offset.</w:t>
+        <w:t>Mulyana, J., &amp; Hermaliani, E. H. (2026). Audit Sistem Informasi Melalui Evaluasi Kapabilitas Tata Kelola Berbasis COBIT 2019. JATI (Jurnal Mahasiswa Teknik Informatika), 10(2), 112-120.</w:t>
       </w:r>
     </w:p>
     <w:p>
@@ -7630,7 +7644,7 @@
           <w:rFonts w:ascii="Times New Roman" w:hAnsi="Times New Roman"/>
           <w:sz w:val="24"/>
         </w:rPr>
-        <w:t>Nugroho, A. (2010). Rekayasa Perangkat Lunak Menggunakan UML dan Java. Yogyakarta: Andi Publisher.</w:t>
+        <w:t>Prasetya, B. R. W. (2025). Analisis Kapabilitas Manajemen Kualitas Tata Kelola Teknologi Informasi pada Institusi Pendidikan Berdasarkan Pendekatan COBIT 2019. Yogyakarta: Universitas AMIKOM.</w:t>
       </w:r>
     </w:p>
     <w:p>
@@ -7644,7 +7658,7 @@
           <w:rFonts w:ascii="Times New Roman" w:hAnsi="Times New Roman"/>
           <w:sz w:val="24"/>
         </w:rPr>
-        <w:t>Sarno, R. (2009). Audit Sistem dan Teknologi Informasi. Surabaya: ITS Press.</w:t>
+        <w:t>Suryono, R. R., &amp; Darmawan, I. (2022). Audit Tata Kelola Infrastruktur Jaringan Laboratorium Komputer Menggunakan COBIT 2019. Jurnal Rekayasa Sistem dan Teknologi Informasi, 6(4), 430-438.</w:t>
       </w:r>
     </w:p>
     <w:p>
@@ -7658,21 +7672,7 @@
           <w:rFonts w:ascii="Times New Roman" w:hAnsi="Times New Roman"/>
           <w:sz w:val="24"/>
         </w:rPr>
-        <w:t>Surendro, K. (2009). Implementasi Tata Kelola Teknologi Informasi. Bandung: Informatika.</w:t>
-      </w:r>
-    </w:p>
-    <w:p>
-      <w:pPr>
-        <w:spacing w:line="360" w:lineRule="auto" w:after="120"/>
-        <w:ind w:left="709" w:hanging="709"/>
-        <w:jc w:val="both"/>
-      </w:pPr>
-      <w:r>
-        <w:rPr>
-          <w:rFonts w:ascii="Times New Roman" w:hAnsi="Times New Roman"/>
-          <w:sz w:val="24"/>
-        </w:rPr>
-        <w:t>Weber, R. (1999). Information Systems Control and Audit. Upper Saddle River, NJ: Prentice Hall.</w:t>
+        <w:t>Wijaya, A., &amp; Kusuma, B. (2023). Analisis Capability Level Tata Kelola Sistem Informasi Sekolah Dasar Berbasis COBIT 2019. Jurnal Nasional Teknologi dan Sistem Informasi, 9(3), 115-124.</w:t>
       </w:r>
     </w:p>
     <w:sectPr>

</xml_diff>